<commit_message>
Fixed the link of the async training and added another explanation about the whereabouts of the system requirements
</commit_message>
<xml_diff>
--- a/מסמכי הכשרות/הכשרת Playwright Agents.docx
+++ b/מסמכי הכשרות/הכשרת Playwright Agents.docx
@@ -518,7 +518,7 @@
           <w:rtl/>
         </w:rPr>
       </w:pPr>
-      <w:bookmarkStart w:id="0" w:name="_Toc224742822"/>
+      <w:bookmarkStart w:id="0" w:name="_Toc224746659"/>
       <w:r>
         <w:rPr>
           <w:rFonts w:hint="cs"/>
@@ -586,7 +586,7 @@
           <w:r>
             <w:fldChar w:fldCharType="separate"/>
           </w:r>
-          <w:hyperlink w:anchor="_Toc224742822" w:history="1">
+          <w:hyperlink w:anchor="_Toc224746659" w:history="1">
             <w:r>
               <w:rPr>
                 <w:rStyle w:val="Hyperlink"/>
@@ -657,7 +657,7 @@
                 <w:noProof/>
                 <w:webHidden/>
               </w:rPr>
-              <w:instrText>Toc224742822 \h</w:instrText>
+              <w:instrText>Toc224746659 \h</w:instrText>
             </w:r>
             <w:r>
               <w:rPr>
@@ -714,7 +714,7 @@
               <w:rtl/>
             </w:rPr>
           </w:pPr>
-          <w:hyperlink w:anchor="_Toc224742823" w:history="1">
+          <w:hyperlink w:anchor="_Toc224746660" w:history="1">
             <w:r>
               <w:rPr>
                 <w:rStyle w:val="Hyperlink"/>
@@ -768,7 +768,7 @@
                 <w:noProof/>
                 <w:webHidden/>
               </w:rPr>
-              <w:instrText>Toc224742823 \h</w:instrText>
+              <w:instrText>Toc224746660 \h</w:instrText>
             </w:r>
             <w:r>
               <w:rPr>
@@ -825,7 +825,7 @@
               <w:rtl/>
             </w:rPr>
           </w:pPr>
-          <w:hyperlink w:anchor="_Toc224742824" w:history="1">
+          <w:hyperlink w:anchor="_Toc224746661" w:history="1">
             <w:r>
               <w:rPr>
                 <w:rStyle w:val="Hyperlink"/>
@@ -945,7 +945,7 @@
                 <w:noProof/>
                 <w:webHidden/>
               </w:rPr>
-              <w:instrText>Toc224742824 \h</w:instrText>
+              <w:instrText>Toc224746661 \h</w:instrText>
             </w:r>
             <w:r>
               <w:rPr>
@@ -1002,7 +1002,7 @@
               <w:rtl/>
             </w:rPr>
           </w:pPr>
-          <w:hyperlink w:anchor="_Toc224742825" w:history="1">
+          <w:hyperlink w:anchor="_Toc224746662" w:history="1">
             <w:r>
               <w:rPr>
                 <w:rStyle w:val="Hyperlink"/>
@@ -1056,7 +1056,7 @@
                 <w:noProof/>
                 <w:webHidden/>
               </w:rPr>
-              <w:instrText>Toc224742825 \h</w:instrText>
+              <w:instrText>Toc224746662 \h</w:instrText>
             </w:r>
             <w:r>
               <w:rPr>
@@ -1113,7 +1113,7 @@
               <w:rtl/>
             </w:rPr>
           </w:pPr>
-          <w:hyperlink w:anchor="_Toc224742826" w:history="1">
+          <w:hyperlink w:anchor="_Toc224746663" w:history="1">
             <w:r>
               <w:rPr>
                 <w:rStyle w:val="Hyperlink"/>
@@ -1165,7 +1165,7 @@
                 <w:noProof/>
                 <w:webHidden/>
               </w:rPr>
-              <w:instrText>Toc224742826 \h</w:instrText>
+              <w:instrText>Toc224746663 \h</w:instrText>
             </w:r>
             <w:r>
               <w:rPr>
@@ -1222,7 +1222,7 @@
               <w:rtl/>
             </w:rPr>
           </w:pPr>
-          <w:hyperlink w:anchor="_Toc224742827" w:history="1">
+          <w:hyperlink w:anchor="_Toc224746664" w:history="1">
             <w:r>
               <w:rPr>
                 <w:rStyle w:val="Hyperlink"/>
@@ -1274,7 +1274,7 @@
                 <w:noProof/>
                 <w:webHidden/>
               </w:rPr>
-              <w:instrText>Toc224742827 \h</w:instrText>
+              <w:instrText>Toc224746664 \h</w:instrText>
             </w:r>
             <w:r>
               <w:rPr>
@@ -1331,7 +1331,7 @@
               <w:rtl/>
             </w:rPr>
           </w:pPr>
-          <w:hyperlink w:anchor="_Toc224742828" w:history="1">
+          <w:hyperlink w:anchor="_Toc224746665" w:history="1">
             <w:r>
               <w:rPr>
                 <w:rStyle w:val="Hyperlink"/>
@@ -1383,7 +1383,7 @@
                 <w:noProof/>
                 <w:webHidden/>
               </w:rPr>
-              <w:instrText>Toc224742828 \h</w:instrText>
+              <w:instrText>Toc224746665 \h</w:instrText>
             </w:r>
             <w:r>
               <w:rPr>
@@ -1440,7 +1440,7 @@
               <w:rtl/>
             </w:rPr>
           </w:pPr>
-          <w:hyperlink w:anchor="_Toc224742829" w:history="1">
+          <w:hyperlink w:anchor="_Toc224746666" w:history="1">
             <w:r>
               <w:rPr>
                 <w:rStyle w:val="Hyperlink"/>
@@ -1526,7 +1526,7 @@
                 <w:noProof/>
                 <w:webHidden/>
               </w:rPr>
-              <w:instrText>Toc224742829 \h</w:instrText>
+              <w:instrText>Toc224746666 \h</w:instrText>
             </w:r>
             <w:r>
               <w:rPr>
@@ -1583,7 +1583,7 @@
               <w:rtl/>
             </w:rPr>
           </w:pPr>
-          <w:hyperlink w:anchor="_Toc224742830" w:history="1">
+          <w:hyperlink w:anchor="_Toc224746667" w:history="1">
             <w:r>
               <w:rPr>
                 <w:rStyle w:val="Hyperlink"/>
@@ -1637,7 +1637,7 @@
                 <w:noProof/>
                 <w:webHidden/>
               </w:rPr>
-              <w:instrText>Toc224742830 \h</w:instrText>
+              <w:instrText>Toc224746667 \h</w:instrText>
             </w:r>
             <w:r>
               <w:rPr>
@@ -1694,7 +1694,7 @@
               <w:rtl/>
             </w:rPr>
           </w:pPr>
-          <w:hyperlink w:anchor="_Toc224742831" w:history="1">
+          <w:hyperlink w:anchor="_Toc224746668" w:history="1">
             <w:r>
               <w:rPr>
                 <w:rStyle w:val="Hyperlink"/>
@@ -1748,7 +1748,7 @@
                 <w:noProof/>
                 <w:webHidden/>
               </w:rPr>
-              <w:instrText>Toc224742831 \h</w:instrText>
+              <w:instrText>Toc224746668 \h</w:instrText>
             </w:r>
             <w:r>
               <w:rPr>
@@ -1805,7 +1805,7 @@
               <w:rtl/>
             </w:rPr>
           </w:pPr>
-          <w:hyperlink w:anchor="_Toc224742832" w:history="1">
+          <w:hyperlink w:anchor="_Toc224746669" w:history="1">
             <w:r>
               <w:rPr>
                 <w:rStyle w:val="Hyperlink"/>
@@ -1859,7 +1859,7 @@
                 <w:noProof/>
                 <w:webHidden/>
               </w:rPr>
-              <w:instrText>Toc224742832 \h</w:instrText>
+              <w:instrText>Toc224746669 \h</w:instrText>
             </w:r>
             <w:r>
               <w:rPr>
@@ -1916,7 +1916,7 @@
               <w:rtl/>
             </w:rPr>
           </w:pPr>
-          <w:hyperlink w:anchor="_Toc224742833" w:history="1">
+          <w:hyperlink w:anchor="_Toc224746670" w:history="1">
             <w:r>
               <w:rPr>
                 <w:rStyle w:val="Hyperlink"/>
@@ -1987,7 +1987,7 @@
                 <w:noProof/>
                 <w:webHidden/>
               </w:rPr>
-              <w:instrText>Toc224742833 \h</w:instrText>
+              <w:instrText>Toc224746670 \h</w:instrText>
             </w:r>
             <w:r>
               <w:rPr>
@@ -2044,7 +2044,7 @@
               <w:rtl/>
             </w:rPr>
           </w:pPr>
-          <w:hyperlink w:anchor="_Toc224742834" w:history="1">
+          <w:hyperlink w:anchor="_Toc224746671" w:history="1">
             <w:r>
               <w:rPr>
                 <w:rStyle w:val="Hyperlink"/>
@@ -2098,7 +2098,7 @@
                 <w:noProof/>
                 <w:webHidden/>
               </w:rPr>
-              <w:instrText>Toc224742834 \h</w:instrText>
+              <w:instrText>Toc224746671 \h</w:instrText>
             </w:r>
             <w:r>
               <w:rPr>
@@ -2155,7 +2155,7 @@
               <w:rtl/>
             </w:rPr>
           </w:pPr>
-          <w:hyperlink w:anchor="_Toc224742835" w:history="1">
+          <w:hyperlink w:anchor="_Toc224746672" w:history="1">
             <w:r>
               <w:rPr>
                 <w:rStyle w:val="Hyperlink"/>
@@ -2207,7 +2207,7 @@
                 <w:noProof/>
                 <w:webHidden/>
               </w:rPr>
-              <w:instrText>Toc224742835 \h</w:instrText>
+              <w:instrText>Toc224746672 \h</w:instrText>
             </w:r>
             <w:r>
               <w:rPr>
@@ -2264,7 +2264,7 @@
               <w:rtl/>
             </w:rPr>
           </w:pPr>
-          <w:hyperlink w:anchor="_Toc224742836" w:history="1">
+          <w:hyperlink w:anchor="_Toc224746673" w:history="1">
             <w:r>
               <w:rPr>
                 <w:rStyle w:val="Hyperlink"/>
@@ -2289,55 +2289,6 @@
                 <w:noProof/>
                 <w:rtl/>
               </w:rPr>
-              <w:t>ה</w:t>
-            </w:r>
-            <w:r>
-              <w:rPr>
-                <w:rStyle w:val="Hyperlink"/>
-                <w:noProof/>
-                <w:rtl/>
-              </w:rPr>
-              <w:t xml:space="preserve"> - </w:t>
-            </w:r>
-            <w:r>
-              <w:rPr>
-                <w:rStyle w:val="Hyperlink"/>
-                <w:noProof/>
-              </w:rPr>
-              <w:t>TUI</w:t>
-            </w:r>
-            <w:r>
-              <w:rPr>
-                <w:rStyle w:val="Hyperlink"/>
-                <w:noProof/>
-                <w:rtl/>
-              </w:rPr>
-              <w:t xml:space="preserve"> </w:t>
-            </w:r>
-            <w:r>
-              <w:rPr>
-                <w:rStyle w:val="Hyperlink"/>
-                <w:rFonts w:hint="eastAsia"/>
-                <w:noProof/>
-                <w:rtl/>
-              </w:rPr>
-              <w:t>של</w:t>
-            </w:r>
-            <w:r>
-              <w:rPr>
-                <w:rStyle w:val="Hyperlink"/>
-                <w:noProof/>
-                <w:rtl/>
-              </w:rPr>
-              <w:t xml:space="preserve"> </w:t>
-            </w:r>
-            <w:r>
-              <w:rPr>
-                <w:rStyle w:val="Hyperlink"/>
-                <w:rFonts w:hint="eastAsia"/>
-                <w:noProof/>
-                <w:rtl/>
-              </w:rPr>
               <w:t>הסוכן</w:t>
             </w:r>
             <w:r>
@@ -2384,7 +2335,7 @@
                 <w:noProof/>
                 <w:webHidden/>
               </w:rPr>
-              <w:instrText>Toc224742836 \h</w:instrText>
+              <w:instrText>Toc224746673 \h</w:instrText>
             </w:r>
             <w:r>
               <w:rPr>
@@ -2441,7 +2392,7 @@
               <w:rtl/>
             </w:rPr>
           </w:pPr>
-          <w:hyperlink w:anchor="_Toc224742837" w:history="1">
+          <w:hyperlink w:anchor="_Toc224746674" w:history="1">
             <w:r>
               <w:rPr>
                 <w:rStyle w:val="Hyperlink"/>
@@ -2563,7 +2514,7 @@
                 <w:noProof/>
                 <w:webHidden/>
               </w:rPr>
-              <w:instrText>Toc224742837 \h</w:instrText>
+              <w:instrText>Toc224746674 \h</w:instrText>
             </w:r>
             <w:r>
               <w:rPr>
@@ -2620,7 +2571,7 @@
               <w:rtl/>
             </w:rPr>
           </w:pPr>
-          <w:hyperlink w:anchor="_Toc224742838" w:history="1">
+          <w:hyperlink w:anchor="_Toc224746675" w:history="1">
             <w:r>
               <w:rPr>
                 <w:rStyle w:val="Hyperlink"/>
@@ -2708,7 +2659,7 @@
                 <w:noProof/>
                 <w:webHidden/>
               </w:rPr>
-              <w:instrText>Toc224742838 \h</w:instrText>
+              <w:instrText>Toc224746675 \h</w:instrText>
             </w:r>
             <w:r>
               <w:rPr>
@@ -2765,7 +2716,7 @@
               <w:rtl/>
             </w:rPr>
           </w:pPr>
-          <w:hyperlink w:anchor="_Toc224742839" w:history="1">
+          <w:hyperlink w:anchor="_Toc224746676" w:history="1">
             <w:r>
               <w:rPr>
                 <w:rStyle w:val="Hyperlink"/>
@@ -2853,7 +2804,7 @@
                 <w:noProof/>
                 <w:webHidden/>
               </w:rPr>
-              <w:instrText>Toc224742839 \h</w:instrText>
+              <w:instrText>Toc224746676 \h</w:instrText>
             </w:r>
             <w:r>
               <w:rPr>
@@ -2884,7 +2835,7 @@
                 <w:webHidden/>
                 <w:rtl/>
               </w:rPr>
-              <w:t>12</w:t>
+              <w:t>13</w:t>
             </w:r>
             <w:r>
               <w:rPr>
@@ -2910,7 +2861,7 @@
               <w:rtl/>
             </w:rPr>
           </w:pPr>
-          <w:hyperlink w:anchor="_Toc224742840" w:history="1">
+          <w:hyperlink w:anchor="_Toc224746677" w:history="1">
             <w:r>
               <w:rPr>
                 <w:rStyle w:val="Hyperlink"/>
@@ -2964,7 +2915,7 @@
                 <w:noProof/>
                 <w:webHidden/>
               </w:rPr>
-              <w:instrText>Toc224742840 \h</w:instrText>
+              <w:instrText>Toc224746677 \h</w:instrText>
             </w:r>
             <w:r>
               <w:rPr>
@@ -3021,7 +2972,7 @@
               <w:rtl/>
             </w:rPr>
           </w:pPr>
-          <w:hyperlink w:anchor="_Toc224742841" w:history="1">
+          <w:hyperlink w:anchor="_Toc224746678" w:history="1">
             <w:r>
               <w:rPr>
                 <w:rStyle w:val="Hyperlink"/>
@@ -3073,7 +3024,7 @@
                 <w:noProof/>
                 <w:webHidden/>
               </w:rPr>
-              <w:instrText>Toc224742841 \h</w:instrText>
+              <w:instrText>Toc224746678 \h</w:instrText>
             </w:r>
             <w:r>
               <w:rPr>
@@ -3130,7 +3081,7 @@
               <w:rtl/>
             </w:rPr>
           </w:pPr>
-          <w:hyperlink w:anchor="_Toc224742842" w:history="1">
+          <w:hyperlink w:anchor="_Toc224746679" w:history="1">
             <w:r>
               <w:rPr>
                 <w:rStyle w:val="Hyperlink"/>
@@ -3184,7 +3135,7 @@
                 <w:noProof/>
                 <w:webHidden/>
               </w:rPr>
-              <w:instrText>Toc224742842 \h</w:instrText>
+              <w:instrText>Toc224746679 \h</w:instrText>
             </w:r>
             <w:r>
               <w:rPr>
@@ -3241,7 +3192,7 @@
               <w:rtl/>
             </w:rPr>
           </w:pPr>
-          <w:hyperlink w:anchor="_Toc224742843" w:history="1">
+          <w:hyperlink w:anchor="_Toc224746680" w:history="1">
             <w:r>
               <w:rPr>
                 <w:rStyle w:val="Hyperlink"/>
@@ -3329,7 +3280,7 @@
                 <w:noProof/>
                 <w:webHidden/>
               </w:rPr>
-              <w:instrText>Toc224742843 \h</w:instrText>
+              <w:instrText>Toc224746680 \h</w:instrText>
             </w:r>
             <w:r>
               <w:rPr>
@@ -3386,7 +3337,7 @@
               <w:rtl/>
             </w:rPr>
           </w:pPr>
-          <w:hyperlink w:anchor="_Toc224742844" w:history="1">
+          <w:hyperlink w:anchor="_Toc224746681" w:history="1">
             <w:r>
               <w:rPr>
                 <w:rStyle w:val="Hyperlink"/>
@@ -3491,7 +3442,7 @@
                 <w:noProof/>
                 <w:webHidden/>
               </w:rPr>
-              <w:instrText>Toc224742844 \h</w:instrText>
+              <w:instrText>Toc224746681 \h</w:instrText>
             </w:r>
             <w:r>
               <w:rPr>
@@ -3548,7 +3499,7 @@
               <w:rtl/>
             </w:rPr>
           </w:pPr>
-          <w:hyperlink w:anchor="_Toc224742845" w:history="1">
+          <w:hyperlink w:anchor="_Toc224746682" w:history="1">
             <w:r>
               <w:rPr>
                 <w:rStyle w:val="Hyperlink"/>
@@ -3634,7 +3585,7 @@
                 <w:noProof/>
                 <w:webHidden/>
               </w:rPr>
-              <w:instrText>Toc224742845 \h</w:instrText>
+              <w:instrText>Toc224746682 \h</w:instrText>
             </w:r>
             <w:r>
               <w:rPr>
@@ -3691,7 +3642,7 @@
               <w:rtl/>
             </w:rPr>
           </w:pPr>
-          <w:hyperlink w:anchor="_Toc224742846" w:history="1">
+          <w:hyperlink w:anchor="_Toc224746683" w:history="1">
             <w:r>
               <w:rPr>
                 <w:rStyle w:val="Hyperlink"/>
@@ -3745,7 +3696,7 @@
                 <w:noProof/>
                 <w:webHidden/>
               </w:rPr>
-              <w:instrText>Toc224742846 \h</w:instrText>
+              <w:instrText>Toc224746683 \h</w:instrText>
             </w:r>
             <w:r>
               <w:rPr>
@@ -3823,35 +3774,13 @@
     </w:p>
     <w:p>
       <w:pPr>
-        <w:rPr>
-          <w:rtl/>
-        </w:rPr>
-      </w:pPr>
-    </w:p>
-    <w:p>
-      <w:pPr>
-        <w:rPr>
-          <w:rtl/>
-        </w:rPr>
-      </w:pPr>
-    </w:p>
-    <w:p>
-      <w:pPr>
-        <w:rPr>
-          <w:rFonts w:hint="cs"/>
-          <w:rtl/>
-        </w:rPr>
-      </w:pPr>
-    </w:p>
-    <w:p>
-      <w:pPr>
         <w:pStyle w:val="1"/>
         <w:rPr>
           <w:rtl/>
         </w:rPr>
       </w:pPr>
       <w:bookmarkStart w:id="1" w:name="_מבוא"/>
-      <w:bookmarkStart w:id="2" w:name="_Toc224742823"/>
+      <w:bookmarkStart w:id="2" w:name="_Toc224746660"/>
       <w:bookmarkEnd w:id="1"/>
       <w:r>
         <w:rPr>
@@ -4400,7 +4329,7 @@
         </w:rPr>
       </w:pPr>
       <w:bookmarkStart w:id="3" w:name="_עשרת_הדיברות_ל"/>
-      <w:bookmarkStart w:id="4" w:name="_Toc224742824"/>
+      <w:bookmarkStart w:id="4" w:name="_Toc224746661"/>
       <w:bookmarkEnd w:id="3"/>
       <w:r>
         <w:rPr>
@@ -5438,40 +5367,6 @@
           <w:rtl/>
         </w:rPr>
       </w:pPr>
-      <w:r>
-        <w:rPr>
-          <w:rFonts w:hint="cs"/>
-          <w:rtl/>
-        </w:rPr>
-        <w:t xml:space="preserve">אם אתם עדיין מתקשים בלהבין איך לכתוב </w:t>
-      </w:r>
-      <w:r>
-        <w:t>Prompt</w:t>
-      </w:r>
-      <w:r>
-        <w:rPr>
-          <w:rFonts w:hint="cs"/>
-          <w:rtl/>
-        </w:rPr>
-        <w:t xml:space="preserve"> כמו שצריך, הסתכלו על הדוגמא </w:t>
-      </w:r>
-      <w:hyperlink w:anchor="_דוגמא_לכתיבת_prompt" w:history="1">
-        <w:r>
-          <w:rPr>
-            <w:rStyle w:val="Hyperlink"/>
-            <w:rFonts w:hint="cs"/>
-            <w:rtl/>
-          </w:rPr>
-          <w:t>בנספח למטה</w:t>
-        </w:r>
-      </w:hyperlink>
-    </w:p>
-    <w:p>
-      <w:pPr>
-        <w:rPr>
-          <w:rtl/>
-        </w:rPr>
-      </w:pPr>
     </w:p>
     <w:p>
       <w:pPr>
@@ -5522,7 +5417,7 @@
           <w:rtl/>
         </w:rPr>
       </w:pPr>
-      <w:bookmarkStart w:id="5" w:name="_Toc224742825"/>
+      <w:bookmarkStart w:id="5" w:name="_Toc224746662"/>
       <w:r>
         <w:rPr>
           <w:rFonts w:hint="cs"/>
@@ -5561,7 +5456,7 @@
       <w:pPr>
         <w:pStyle w:val="2"/>
       </w:pPr>
-      <w:bookmarkStart w:id="6" w:name="_Toc224742826"/>
+      <w:bookmarkStart w:id="6" w:name="_Toc224746663"/>
       <w:r>
         <w:t>VSCode</w:t>
       </w:r>
@@ -5620,7 +5515,7 @@
       <w:pPr>
         <w:pStyle w:val="2"/>
       </w:pPr>
-      <w:bookmarkStart w:id="7" w:name="_Toc224742827"/>
+      <w:bookmarkStart w:id="7" w:name="_Toc224746664"/>
       <w:r>
         <w:t>Node.js</w:t>
       </w:r>
@@ -5665,7 +5560,7 @@
           <w:rtl/>
         </w:rPr>
       </w:pPr>
-      <w:bookmarkStart w:id="8" w:name="_Toc224742828"/>
+      <w:bookmarkStart w:id="8" w:name="_Toc224746665"/>
       <w:r>
         <w:t>OpenCode</w:t>
       </w:r>
@@ -5881,7 +5776,7 @@
           <w:rtl/>
         </w:rPr>
       </w:pPr>
-      <w:bookmarkStart w:id="10" w:name="_Toc224742829"/>
+      <w:bookmarkStart w:id="10" w:name="_Toc224746666"/>
       <w:r>
         <w:rPr>
           <w:rFonts w:hint="cs"/>
@@ -5909,7 +5804,7 @@
           <w:rtl/>
         </w:rPr>
       </w:pPr>
-      <w:bookmarkStart w:id="11" w:name="_Toc224742830"/>
+      <w:bookmarkStart w:id="11" w:name="_Toc224746667"/>
       <w:r>
         <w:rPr>
           <w:rFonts w:hint="cs"/>
@@ -6406,7 +6301,6 @@
     <w:p>
       <w:pPr>
         <w:rPr>
-          <w:rFonts w:hint="cs"/>
           <w:rtl/>
         </w:rPr>
       </w:pPr>
@@ -6595,7 +6489,7 @@
           <w:rtl/>
         </w:rPr>
       </w:pPr>
-      <w:bookmarkStart w:id="12" w:name="_Toc224742831"/>
+      <w:bookmarkStart w:id="12" w:name="_Toc224746668"/>
       <w:r>
         <w:rPr>
           <w:rFonts w:hint="cs"/>
@@ -6633,7 +6527,6 @@
     <w:p>
       <w:pPr>
         <w:rPr>
-          <w:rFonts w:hint="cs"/>
           <w:rtl/>
         </w:rPr>
       </w:pPr>
@@ -6754,7 +6647,6 @@
     <w:p>
       <w:pPr>
         <w:rPr>
-          <w:rFonts w:hint="cs"/>
           <w:rtl/>
         </w:rPr>
       </w:pPr>
@@ -6794,7 +6686,7 @@
           <w:rtl/>
         </w:rPr>
       </w:pPr>
-      <w:bookmarkStart w:id="13" w:name="_Toc224742832"/>
+      <w:bookmarkStart w:id="13" w:name="_Toc224746669"/>
       <w:r>
         <w:rPr>
           <w:rFonts w:hint="cs"/>
@@ -7202,15 +7094,7 @@
         <w:t>Goal:</w:t>
       </w:r>
       <w:r>
-        <w:t xml:space="preserve"> </w:t>
-      </w:r>
-      <w:proofErr w:type="gramStart"/>
-      <w:r>
-        <w:t>Guide</w:t>
-      </w:r>
-      <w:proofErr w:type="gramEnd"/>
-      <w:r>
-        <w:t xml:space="preserve"> the AI’s reasoning</w:t>
+        <w:t xml:space="preserve"> Guide the AI’s reasoning</w:t>
       </w:r>
     </w:p>
     <w:p>
@@ -7245,13 +7129,8 @@
         </w:numPr>
         <w:bidi w:val="0"/>
       </w:pPr>
-      <w:proofErr w:type="gramStart"/>
-      <w:r>
-        <w:t>Plan</w:t>
-      </w:r>
-      <w:proofErr w:type="gramEnd"/>
-      <w:r>
-        <w:t xml:space="preserve"> a trip</w:t>
+      <w:r>
+        <w:t>Plan a trip</w:t>
       </w:r>
     </w:p>
     <w:p>
@@ -7430,7 +7309,6 @@
     <w:p>
       <w:pPr>
         <w:rPr>
-          <w:rFonts w:hint="cs"/>
           <w:rtl/>
         </w:rPr>
       </w:pPr>
@@ -7439,7 +7317,7 @@
       <w:pPr>
         <w:pStyle w:val="1"/>
       </w:pPr>
-      <w:bookmarkStart w:id="14" w:name="_Toc224742833"/>
+      <w:bookmarkStart w:id="14" w:name="_Toc224746670"/>
       <w:r>
         <w:rPr>
           <w:rFonts w:hint="cs"/>
@@ -7458,7 +7336,7 @@
         </w:rPr>
       </w:pPr>
       <w:bookmarkStart w:id="15" w:name="_מבוא_1"/>
-      <w:bookmarkStart w:id="16" w:name="_Toc224742834"/>
+      <w:bookmarkStart w:id="16" w:name="_Toc224746671"/>
       <w:bookmarkEnd w:id="15"/>
       <w:r>
         <w:rPr>
@@ -8026,7 +7904,7 @@
       <w:pPr>
         <w:pStyle w:val="2"/>
       </w:pPr>
-      <w:bookmarkStart w:id="17" w:name="_Toc224742835"/>
+      <w:bookmarkStart w:id="17" w:name="_Toc224746672"/>
       <w:r>
         <w:lastRenderedPageBreak/>
         <w:t>OpenCode</w:t>
@@ -8154,9 +8032,6 @@
           <w:ilvl w:val="0"/>
           <w:numId w:val="6"/>
         </w:numPr>
-        <w:rPr>
-          <w:rtl/>
-        </w:rPr>
       </w:pPr>
       <w:r>
         <w:rPr>
@@ -8168,33 +8043,105 @@
     </w:p>
     <w:p>
       <w:pPr>
+        <w:rPr>
+          <w:rtl/>
+        </w:rPr>
+      </w:pPr>
+      <w:r>
+        <w:rPr>
+          <w:rFonts w:hint="cs"/>
+          <w:highlight w:val="cyan"/>
+          <w:rtl/>
+        </w:rPr>
+        <w:t>ב</w:t>
+      </w:r>
+      <w:r>
+        <w:rPr>
+          <w:rFonts w:hint="cs"/>
+          <w:highlight w:val="cyan"/>
+          <w:rtl/>
+        </w:rPr>
+        <w:t xml:space="preserve">חלק הזה, אנו נפתח </w:t>
+      </w:r>
+      <w:r>
+        <w:rPr>
+          <w:rFonts w:hint="cs"/>
+          <w:highlight w:val="cyan"/>
+          <w:rtl/>
+        </w:rPr>
+        <w:t>את הסוכן</w:t>
+      </w:r>
+      <w:r>
+        <w:rPr>
+          <w:rFonts w:hint="cs"/>
+          <w:highlight w:val="cyan"/>
+          <w:rtl/>
+        </w:rPr>
+        <w:t xml:space="preserve"> בתיקייה ריקה</w:t>
+      </w:r>
+    </w:p>
+    <w:p>
+      <w:pPr>
+        <w:rPr>
+          <w:rtl/>
+        </w:rPr>
+      </w:pPr>
+    </w:p>
+    <w:p>
+      <w:pPr>
         <w:pStyle w:val="3"/>
         <w:rPr>
           <w:rtl/>
         </w:rPr>
       </w:pPr>
-      <w:bookmarkStart w:id="18" w:name="_Toc224742836"/>
-      <w:r>
-        <w:rPr>
-          <w:rFonts w:hint="cs"/>
-          <w:rtl/>
-        </w:rPr>
-        <w:t xml:space="preserve">פתיחת ה - </w:t>
-      </w:r>
-      <w:r>
-        <w:t>TUI</w:t>
-      </w:r>
-      <w:r>
-        <w:rPr>
-          <w:rFonts w:hint="cs"/>
-          <w:rtl/>
-        </w:rPr>
-        <w:t xml:space="preserve"> של הסוכן</w:t>
+      <w:bookmarkStart w:id="18" w:name="_Toc224746673"/>
+      <w:r>
+        <w:rPr>
+          <w:rFonts w:hint="cs"/>
+          <w:rtl/>
+        </w:rPr>
+        <w:t>פתיחת הסוכן</w:t>
       </w:r>
       <w:bookmarkEnd w:id="18"/>
     </w:p>
     <w:p>
       <w:pPr>
+        <w:pStyle w:val="4"/>
+        <w:rPr>
+          <w:rtl/>
+        </w:rPr>
+      </w:pPr>
+      <w:r>
+        <w:rPr>
+          <w:rFonts w:hint="cs"/>
+          <w:rtl/>
+        </w:rPr>
+        <w:t>הורד</w:t>
+      </w:r>
+      <w:r>
+        <w:rPr>
+          <w:rFonts w:hint="cs"/>
+          <w:rtl/>
+        </w:rPr>
+        <w:t>ה</w:t>
+      </w:r>
+      <w:r>
+        <w:rPr>
+          <w:rFonts w:hint="cs"/>
+          <w:rtl/>
+        </w:rPr>
+        <w:t xml:space="preserve"> עם </w:t>
+      </w:r>
+      <w:r>
+        <w:rPr>
+          <w:rFonts w:hint="cs"/>
+          <w:rtl/>
+        </w:rPr>
+        <w:t>פקודה</w:t>
+      </w:r>
+    </w:p>
+    <w:p>
+      <w:pPr>
         <w:rPr>
           <w:rtl/>
         </w:rPr>
@@ -8214,18 +8161,15 @@
           <w:rFonts w:hint="cs"/>
           <w:rtl/>
         </w:rPr>
-        <w:t xml:space="preserve"> בתיקייה של הפרויקט שיצרתם בשלב </w:t>
-      </w:r>
-      <w:hyperlink w:anchor="_Playwright_Agents" w:history="1">
-        <w:r>
-          <w:rPr>
-            <w:rStyle w:val="Hyperlink"/>
-            <w:rFonts w:hint="cs"/>
-            <w:rtl/>
-          </w:rPr>
-          <w:t>ההתקנות</w:t>
-        </w:r>
-      </w:hyperlink>
+        <w:t xml:space="preserve"> בתיקייה </w:t>
+      </w:r>
+      <w:r>
+        <w:rPr>
+          <w:rFonts w:hint="cs"/>
+          <w:rtl/>
+        </w:rPr>
+        <w:t>ריקה</w:t>
+      </w:r>
       <w:r>
         <w:rPr>
           <w:rFonts w:hint="cs"/>
@@ -8300,12 +8244,49 @@
     </w:p>
     <w:p>
       <w:pPr>
+        <w:pStyle w:val="4"/>
+        <w:rPr>
+          <w:rtl/>
+        </w:rPr>
+      </w:pPr>
+      <w:r>
+        <w:rPr>
+          <w:rFonts w:hint="cs"/>
+          <w:rtl/>
+        </w:rPr>
+        <w:t>הורדה כאפליקציה</w:t>
+      </w:r>
+    </w:p>
+    <w:p>
+      <w:pPr>
+        <w:rPr>
+          <w:rtl/>
+        </w:rPr>
+      </w:pPr>
+      <w:r>
+        <w:rPr>
+          <w:rFonts w:hint="cs"/>
+          <w:rtl/>
+        </w:rPr>
+        <w:t xml:space="preserve">פתחו את האפליקציה כמו כל אפליקציה, ובתוך האפליקציה, פתחו את התיקייה </w:t>
+      </w:r>
+      <w:r>
+        <w:rPr>
+          <w:rFonts w:hint="cs"/>
+          <w:rtl/>
+        </w:rPr>
+        <w:t>הריקה שיצרתם.</w:t>
+      </w:r>
+    </w:p>
+    <w:p/>
+    <w:p>
+      <w:pPr>
         <w:pStyle w:val="3"/>
         <w:rPr>
           <w:rtl/>
         </w:rPr>
       </w:pPr>
-      <w:bookmarkStart w:id="19" w:name="_Toc224742837"/>
+      <w:bookmarkStart w:id="19" w:name="_Toc224746674"/>
       <w:r>
         <w:rPr>
           <w:rFonts w:hint="cs"/>
@@ -8550,29 +8531,62 @@
         </w:rPr>
         <w:t>יותר חזקים</w:t>
       </w:r>
-    </w:p>
-    <w:p>
-      <w:pPr>
-        <w:rPr>
-          <w:rtl/>
-        </w:rPr>
-      </w:pPr>
-      <w:r>
-        <w:rPr>
-          <w:rFonts w:hint="cs"/>
-          <w:rtl/>
-        </w:rPr>
-        <w:t xml:space="preserve">על מנת לעשות את זה, מכיוון שנכנסתם לתוך ה - </w:t>
+      <w:r>
+        <w:rPr>
+          <w:rFonts w:hint="cs"/>
+          <w:rtl/>
+        </w:rPr>
+        <w:t>.</w:t>
+      </w:r>
+    </w:p>
+    <w:p>
+      <w:pPr>
+        <w:pStyle w:val="5"/>
+        <w:rPr>
+          <w:rtl/>
+        </w:rPr>
+      </w:pPr>
+      <w:r>
+        <w:rPr>
+          <w:rFonts w:hint="cs"/>
+          <w:rtl/>
+        </w:rPr>
+        <w:lastRenderedPageBreak/>
+        <w:t xml:space="preserve">דרך ה - </w:t>
       </w:r>
       <w:r>
         <w:t>TUI</w:t>
       </w:r>
-      <w:r>
-        <w:rPr>
-          <w:rFonts w:hint="cs"/>
-          <w:rtl/>
-        </w:rPr>
-        <w:t xml:space="preserve"> של הסוכן, כתבו את הפקודה הבאה:</w:t>
+    </w:p>
+    <w:p>
+      <w:pPr>
+        <w:rPr>
+          <w:rtl/>
+        </w:rPr>
+      </w:pPr>
+      <w:r>
+        <w:rPr>
+          <w:rFonts w:hint="cs"/>
+          <w:rtl/>
+        </w:rPr>
+        <w:t xml:space="preserve">אנו נצא מהסוכן של </w:t>
+      </w:r>
+      <w:r>
+        <w:t>opencode</w:t>
+      </w:r>
+      <w:r>
+        <w:rPr>
+          <w:rFonts w:hint="cs"/>
+          <w:rtl/>
+        </w:rPr>
+        <w:t xml:space="preserve">, </w:t>
+      </w:r>
+      <w:r>
+        <w:rPr>
+          <w:rFonts w:hint="cs"/>
+          <w:rtl/>
+        </w:rPr>
+        <w:t>עם הפקודה הבאה:</w:t>
       </w:r>
     </w:p>
     <w:p>
@@ -8581,36 +8595,7 @@
         <w:bidi w:val="0"/>
       </w:pPr>
       <w:r>
-        <w:t>/</w:t>
-      </w:r>
-      <w:proofErr w:type="gramStart"/>
-      <w:r>
-        <w:t>exit</w:t>
-      </w:r>
-      <w:proofErr w:type="gramEnd"/>
-    </w:p>
-    <w:p>
-      <w:pPr>
-        <w:rPr>
-          <w:rtl/>
-        </w:rPr>
-      </w:pPr>
-      <w:r>
-        <w:rPr>
-          <w:rFonts w:hint="cs"/>
-          <w:rtl/>
-        </w:rPr>
-        <w:t xml:space="preserve">זה יצא מה - </w:t>
-      </w:r>
-      <w:r>
-        <w:t>TUI</w:t>
-      </w:r>
-      <w:r>
-        <w:rPr>
-          <w:rFonts w:hint="cs"/>
-          <w:rtl/>
-        </w:rPr>
-        <w:t xml:space="preserve"> של הסוכן.</w:t>
+        <w:t>/exit</w:t>
       </w:r>
     </w:p>
     <w:p>
@@ -8749,7 +8734,6 @@
           <w:rFonts w:hint="cs"/>
           <w:rtl/>
         </w:rPr>
-        <w:lastRenderedPageBreak/>
         <w:t xml:space="preserve">כאן תתבקשו להתחבר עם המשתמש שיש לכם באחד מהחברות שציינו, במידה ואין לכם, אתם מוזמנים להתחבר עם ה - </w:t>
       </w:r>
       <w:r>
@@ -8761,6 +8745,77 @@
           <w:rtl/>
         </w:rPr>
         <w:t xml:space="preserve"> שלכם או המייל.</w:t>
+      </w:r>
+    </w:p>
+    <w:p>
+      <w:pPr>
+        <w:pStyle w:val="5"/>
+        <w:rPr>
+          <w:rtl/>
+        </w:rPr>
+      </w:pPr>
+      <w:r>
+        <w:rPr>
+          <w:rFonts w:hint="cs"/>
+          <w:rtl/>
+        </w:rPr>
+        <w:t>דרך האפליקציה</w:t>
+      </w:r>
+    </w:p>
+    <w:p>
+      <w:pPr>
+        <w:rPr>
+          <w:rtl/>
+        </w:rPr>
+      </w:pPr>
+      <w:r>
+        <w:rPr>
+          <w:rFonts w:hint="cs"/>
+          <w:rtl/>
+        </w:rPr>
+        <w:t xml:space="preserve">לחצו על כפתור ההגדרות, תחת </w:t>
+      </w:r>
+      <w:r>
+        <w:t>providers</w:t>
+      </w:r>
+    </w:p>
+    <w:p>
+      <w:pPr>
+        <w:rPr>
+          <w:rtl/>
+        </w:rPr>
+      </w:pPr>
+      <w:r>
+        <w:rPr>
+          <w:rFonts w:hint="cs"/>
+          <w:rtl/>
+        </w:rPr>
+        <w:t xml:space="preserve">בצעו </w:t>
+      </w:r>
+      <w:r>
+        <w:t>connect</w:t>
+      </w:r>
+      <w:r>
+        <w:rPr>
+          <w:rFonts w:hint="cs"/>
+          <w:rtl/>
+        </w:rPr>
+        <w:t xml:space="preserve"> לחברה שאתם מנויים אליה, והמשיכו את תהליך ההתחברות שלכם.</w:t>
+      </w:r>
+    </w:p>
+    <w:p>
+      <w:pPr>
+        <w:pStyle w:val="5"/>
+        <w:rPr>
+          <w:rtl/>
+        </w:rPr>
+      </w:pPr>
+      <w:r>
+        <w:rPr>
+          <w:rFonts w:hint="cs"/>
+          <w:rtl/>
+        </w:rPr>
+        <w:t>כללי</w:t>
       </w:r>
     </w:p>
     <w:p>
@@ -8816,7 +8871,21 @@
           <w:rFonts w:hint="cs"/>
           <w:rtl/>
         </w:rPr>
-        <w:t>, וכתבו לו את הפקודה הבאה:</w:t>
+        <w:t xml:space="preserve">, </w:t>
+      </w:r>
+      <w:r>
+        <w:rPr>
+          <w:rFonts w:hint="cs"/>
+          <w:rtl/>
+        </w:rPr>
+        <w:t xml:space="preserve">או לאפליקציה, </w:t>
+      </w:r>
+      <w:r>
+        <w:rPr>
+          <w:rFonts w:hint="cs"/>
+          <w:rtl/>
+        </w:rPr>
+        <w:t>וכתבו לו את הפקודה הבאה:</w:t>
       </w:r>
     </w:p>
     <w:p>
@@ -8825,13 +8894,8 @@
         <w:bidi w:val="0"/>
       </w:pPr>
       <w:r>
-        <w:t>/</w:t>
-      </w:r>
-      <w:proofErr w:type="gramStart"/>
-      <w:r>
-        <w:t>models</w:t>
-      </w:r>
-      <w:proofErr w:type="gramEnd"/>
+        <w:t>/models</w:t>
+      </w:r>
     </w:p>
     <w:p>
       <w:pPr>
@@ -9178,6 +9242,7 @@
         <w:rPr>
           <w:rtl/>
         </w:rPr>
+        <w:lastRenderedPageBreak/>
         <w:t xml:space="preserve">עד ~10,000 </w:t>
       </w:r>
       <w:r>
@@ -9502,7 +9567,6 @@
         <w:rPr>
           <w:rtl/>
         </w:rPr>
-        <w:lastRenderedPageBreak/>
         <w:t>סבירה</w:t>
       </w:r>
       <w:r>
@@ -9799,9 +9863,6 @@
           <w:ilvl w:val="0"/>
           <w:numId w:val="33"/>
         </w:numPr>
-        <w:rPr>
-          <w:rtl/>
-        </w:rPr>
       </w:pPr>
       <w:r>
         <w:rPr>
@@ -9825,12 +9886,19 @@
     </w:p>
     <w:p>
       <w:pPr>
+        <w:rPr>
+          <w:rtl/>
+        </w:rPr>
+      </w:pPr>
+    </w:p>
+    <w:p>
+      <w:pPr>
         <w:pStyle w:val="3"/>
         <w:rPr>
           <w:rtl/>
         </w:rPr>
       </w:pPr>
-      <w:bookmarkStart w:id="20" w:name="_Toc224742838"/>
+      <w:bookmarkStart w:id="20" w:name="_Toc224746675"/>
       <w:r>
         <w:rPr>
           <w:rFonts w:hint="cs"/>
@@ -9964,6 +10032,7 @@
         </w:numPr>
       </w:pPr>
       <w:r>
+        <w:lastRenderedPageBreak/>
         <w:t>Plan</w:t>
       </w:r>
       <w:r>
@@ -10075,21 +10144,21 @@
       <w:r>
         <w:rPr>
           <w:rFonts w:hint="cs"/>
-          <w:highlight w:val="blue"/>
+          <w:highlight w:val="cyan"/>
           <w:rtl/>
         </w:rPr>
         <w:t xml:space="preserve">בשביל לעבור ממצב תכנון לביצוע, לחצו על </w:t>
       </w:r>
       <w:r>
         <w:rPr>
-          <w:highlight w:val="blue"/>
+          <w:highlight w:val="cyan"/>
         </w:rPr>
         <w:t>TAB</w:t>
       </w:r>
       <w:r>
         <w:rPr>
           <w:rFonts w:hint="cs"/>
-          <w:highlight w:val="blue"/>
+          <w:highlight w:val="cyan"/>
           <w:rtl/>
         </w:rPr>
         <w:t>.</w:t>
@@ -10097,12 +10166,19 @@
     </w:p>
     <w:p>
       <w:pPr>
+        <w:rPr>
+          <w:rtl/>
+        </w:rPr>
+      </w:pPr>
+    </w:p>
+    <w:p>
+      <w:pPr>
         <w:pStyle w:val="3"/>
         <w:rPr>
           <w:rtl/>
         </w:rPr>
       </w:pPr>
-      <w:bookmarkStart w:id="21" w:name="_Toc224742839"/>
+      <w:bookmarkStart w:id="21" w:name="_Toc224746676"/>
       <w:r>
         <w:rPr>
           <w:rFonts w:hint="cs"/>
@@ -10124,16 +10200,6 @@
           <w:rtl/>
         </w:rPr>
         <w:t xml:space="preserve">בתוך ה - </w:t>
-      </w:r>
-      <w:r>
-        <w:t>TUI</w:t>
-      </w:r>
-      <w:r>
-        <w:rPr>
-          <w:rFonts w:hint="cs"/>
-          <w:rtl/>
-        </w:rPr>
-        <w:t xml:space="preserve"> של </w:t>
       </w:r>
       <w:r>
         <w:t>opencode</w:t>
@@ -10152,13 +10218,8 @@
         <w:bidi w:val="0"/>
       </w:pPr>
       <w:r>
-        <w:t>/</w:t>
-      </w:r>
-      <w:proofErr w:type="gramStart"/>
-      <w:r>
-        <w:t>init</w:t>
-      </w:r>
-      <w:proofErr w:type="gramEnd"/>
+        <w:t>/init</w:t>
+      </w:r>
     </w:p>
     <w:p>
       <w:pPr>
@@ -10251,7 +10312,6 @@
           <w:rFonts w:hint="cs"/>
           <w:rtl/>
         </w:rPr>
-        <w:lastRenderedPageBreak/>
         <w:t xml:space="preserve">אם תבקשו ממנו ליצור את הקובץ, הקובץ שייווצר יהיה מאוד כללי (בתיקיית הפרויקט), ותוכלו לבקש ממנו לשנות אותו אחר כך (או לשנות ידנית את הקובץ) בהתאם לדרישות הפרויקט\הניסיון האישי </w:t>
       </w:r>
       <w:r>
@@ -10275,6 +10335,7 @@
     <w:p>
       <w:pPr>
         <w:rPr>
+          <w:rFonts w:hint="cs"/>
           <w:rtl/>
         </w:rPr>
       </w:pPr>
@@ -10286,106 +10347,26 @@
         <w:t xml:space="preserve">עכשיו כשיש לנו מודל, ואנחנו יודעים איך להפעיל את הסוכן, בואו נעבור קצת לתרגול </w:t>
       </w:r>
       <w:r>
-        <w:t>prompting</w:t>
-      </w:r>
-    </w:p>
-    <w:p>
-      <w:pPr>
-        <w:rPr>
-          <w:rtl/>
-        </w:rPr>
-      </w:pPr>
-    </w:p>
-    <w:p>
-      <w:pPr>
-        <w:rPr>
-          <w:rtl/>
-        </w:rPr>
-      </w:pPr>
-    </w:p>
-    <w:p>
-      <w:pPr>
-        <w:rPr>
-          <w:rtl/>
-        </w:rPr>
-      </w:pPr>
-    </w:p>
-    <w:p>
-      <w:pPr>
-        <w:rPr>
-          <w:rtl/>
-        </w:rPr>
-      </w:pPr>
-    </w:p>
-    <w:p>
-      <w:pPr>
-        <w:rPr>
-          <w:rtl/>
-        </w:rPr>
-      </w:pPr>
-    </w:p>
-    <w:p>
-      <w:pPr>
-        <w:rPr>
-          <w:rtl/>
-        </w:rPr>
-      </w:pPr>
-    </w:p>
-    <w:p>
-      <w:pPr>
-        <w:rPr>
-          <w:rtl/>
-        </w:rPr>
-      </w:pPr>
-    </w:p>
-    <w:p>
-      <w:pPr>
-        <w:rPr>
-          <w:rtl/>
-        </w:rPr>
-      </w:pPr>
-    </w:p>
-    <w:p>
-      <w:pPr>
-        <w:rPr>
-          <w:rtl/>
-        </w:rPr>
-      </w:pPr>
-    </w:p>
-    <w:p>
-      <w:pPr>
-        <w:rPr>
-          <w:rtl/>
-        </w:rPr>
-      </w:pPr>
-    </w:p>
-    <w:p>
-      <w:pPr>
-        <w:rPr>
-          <w:rtl/>
-        </w:rPr>
-      </w:pPr>
-    </w:p>
-    <w:p>
-      <w:pPr>
-        <w:rPr>
-          <w:rtl/>
-        </w:rPr>
-      </w:pPr>
-    </w:p>
-    <w:p>
-      <w:pPr>
-        <w:rPr>
-          <w:rtl/>
-        </w:rPr>
-      </w:pPr>
-    </w:p>
-    <w:p>
-      <w:pPr>
-        <w:rPr>
-          <w:rtl/>
-        </w:rPr>
-      </w:pPr>
+        <w:rPr>
+          <mc:AlternateContent>
+            <mc:Choice Requires="w16se">
+              <w:rFonts w:hint="cs"/>
+            </mc:Choice>
+            <mc:Fallback>
+              <w:rFonts w:ascii="Segoe UI Emoji" w:eastAsia="Segoe UI Emoji" w:hAnsi="Segoe UI Emoji" w:cs="Segoe UI Emoji"/>
+            </mc:Fallback>
+          </mc:AlternateContent>
+          <w:rtl/>
+        </w:rPr>
+        <mc:AlternateContent>
+          <mc:Choice Requires="w16se">
+            <w16se:symEx w16se:font="Segoe UI Emoji" w16se:char="1F916"/>
+          </mc:Choice>
+          <mc:Fallback>
+            <w:t>🤖</w:t>
+          </mc:Fallback>
+        </mc:AlternateContent>
+      </w:r>
     </w:p>
     <w:p>
       <w:pPr>
@@ -10478,7 +10459,7 @@
           <w:rtl/>
         </w:rPr>
       </w:pPr>
-      <w:bookmarkStart w:id="22" w:name="_Toc224742840"/>
+      <w:bookmarkStart w:id="22" w:name="_Toc224746677"/>
       <w:r>
         <w:rPr>
           <w:rFonts w:hint="cs"/>
@@ -11067,7 +11048,7 @@
       <w:pPr>
         <w:pStyle w:val="2"/>
       </w:pPr>
-      <w:bookmarkStart w:id="23" w:name="_Toc224742841"/>
+      <w:bookmarkStart w:id="23" w:name="_Toc224746678"/>
       <w:r>
         <w:lastRenderedPageBreak/>
         <w:t>Playwright Agents</w:t>
@@ -11314,7 +11295,7 @@
           <w:rtl/>
         </w:rPr>
       </w:pPr>
-      <w:bookmarkStart w:id="24" w:name="_Toc224742842"/>
+      <w:bookmarkStart w:id="24" w:name="_Toc224746679"/>
       <w:r>
         <w:rPr>
           <w:rFonts w:hint="cs"/>
@@ -12121,14 +12102,12 @@
         <w:shd w:val="clear" w:color="auto" w:fill="000000" w:themeFill="text1"/>
         <w:bidi w:val="0"/>
       </w:pPr>
-      <w:proofErr w:type="gramStart"/>
       <w:r>
         <w:t>@playwright-test-</w:t>
       </w:r>
       <w:r>
         <w:t>planner</w:t>
       </w:r>
-      <w:proofErr w:type="gramEnd"/>
     </w:p>
     <w:p>
       <w:pPr>
@@ -13722,14 +13701,12 @@
         <w:shd w:val="clear" w:color="auto" w:fill="000000" w:themeFill="text1"/>
         <w:bidi w:val="0"/>
       </w:pPr>
-      <w:proofErr w:type="gramStart"/>
       <w:r>
         <w:t>@playwright-test-heale</w:t>
       </w:r>
       <w:r>
         <w:t>r</w:t>
       </w:r>
-      <w:proofErr w:type="gramEnd"/>
     </w:p>
     <w:p>
       <w:pPr>
@@ -14182,7 +14159,7 @@
           <w:rtl/>
         </w:rPr>
       </w:pPr>
-      <w:bookmarkStart w:id="25" w:name="_Toc224742843"/>
+      <w:bookmarkStart w:id="25" w:name="_Toc224746680"/>
       <w:r>
         <w:rPr>
           <w:rFonts w:hint="cs"/>
@@ -14416,7 +14393,7 @@
           <w:rtl/>
         </w:rPr>
       </w:pPr>
-      <w:bookmarkStart w:id="26" w:name="_Toc224742844"/>
+      <w:bookmarkStart w:id="26" w:name="_Toc224746681"/>
       <w:r>
         <w:rPr>
           <w:rFonts w:hint="cs"/>
@@ -14447,10 +14424,14 @@
           <w:rFonts w:hint="cs"/>
           <w:rtl/>
         </w:rPr>
-        <w:t xml:space="preserve">, כתבו את הפקודה הבאה ב - </w:t>
-      </w:r>
-      <w:r>
-        <w:t>TUI</w:t>
+        <w:t>, כתבו את הפקודה הבאה</w:t>
+      </w:r>
+      <w:r>
+        <w:rPr>
+          <w:rFonts w:hint="cs"/>
+          <w:rtl/>
+        </w:rPr>
+        <w:t xml:space="preserve"> בסוכן</w:t>
       </w:r>
       <w:r>
         <w:rPr>
@@ -14469,13 +14450,8 @@
         </w:rPr>
       </w:pPr>
       <w:r>
-        <w:t>/</w:t>
-      </w:r>
-      <w:proofErr w:type="gramStart"/>
-      <w:r>
-        <w:t>status</w:t>
-      </w:r>
-      <w:proofErr w:type="gramEnd"/>
+        <w:t>/status</w:t>
+      </w:r>
     </w:p>
     <w:p>
       <w:pPr>
@@ -14519,7 +14495,7 @@
         </w:rPr>
       </w:pPr>
       <w:bookmarkStart w:id="27" w:name="_קובץ_ה_-"/>
-      <w:bookmarkStart w:id="28" w:name="_Toc224742845"/>
+      <w:bookmarkStart w:id="28" w:name="_Toc224746682"/>
       <w:bookmarkEnd w:id="27"/>
       <w:r>
         <w:rPr>
@@ -14889,7 +14865,7 @@
           <w:rtl/>
         </w:rPr>
       </w:pPr>
-      <w:bookmarkStart w:id="29" w:name="_Toc224742846"/>
+      <w:bookmarkStart w:id="29" w:name="_Toc224746683"/>
       <w:r>
         <w:rPr>
           <w:rFonts w:hint="cs"/>
@@ -16686,9 +16662,6 @@
       </w:pPr>
     </w:p>
     <w:sectPr>
-      <w:headerReference w:type="even" r:id="rId21"/>
-      <w:headerReference w:type="default" r:id="rId22"/>
-      <w:headerReference w:type="first" r:id="rId23"/>
       <w:pgSz w:w="11906" w:h="16838"/>
       <w:pgMar w:top="1440" w:right="1800" w:bottom="1440" w:left="1800" w:header="708" w:footer="708" w:gutter="0"/>
       <w:cols w:space="708"/>
@@ -16748,36 +16721,6 @@
     </w:p>
   </w:footnote>
 </w:footnotes>
-</file>
-
-<file path=word/header1.xml><?xml version="1.0" encoding="utf-8"?>
-<w:hdr xmlns:wpc="http://schemas.microsoft.com/office/word/2010/wordprocessingCanvas" xmlns:cx="http://schemas.microsoft.com/office/drawing/2014/chartex" xmlns:cx1="http://schemas.microsoft.com/office/drawing/2015/9/8/chartex" xmlns:cx2="http://schemas.microsoft.com/office/drawing/2015/10/21/chartex" xmlns:cx3="http://schemas.microsoft.com/office/drawing/2016/5/9/chartex" xmlns:cx4="http://schemas.microsoft.com/office/drawing/2016/5/10/chartex" xmlns:cx5="http://schemas.microsoft.com/office/drawing/2016/5/11/chartex" xmlns:cx6="http://schemas.microsoft.com/office/drawing/2016/5/12/chartex" xmlns:cx7="http://schemas.microsoft.com/office/drawing/2016/5/13/chartex" xmlns:cx8="http://schemas.microsoft.com/office/drawing/2016/5/14/chartex" xmlns:mc="http://schemas.openxmlformats.org/markup-compatibility/2006" xmlns:aink="http://schemas.microsoft.com/office/drawing/2016/ink" xmlns:am3d="http://schemas.microsoft.com/office/drawing/2017/model3d" xmlns:o="urn:schemas-microsoft-com:office:office" xmlns:oel="http://schemas.microsoft.com/office/2019/extlst" xmlns:r="http://schemas.openxmlformats.org/officeDocument/2006/relationships" xmlns:m="http://schemas.openxmlformats.org/officeDocument/2006/math" xmlns:v="urn:schemas-microsoft-com:vml" xmlns:wp14="http://schemas.microsoft.com/office/word/2010/wordprocessingDrawing" xmlns:wp="http://schemas.openxmlformats.org/drawingml/2006/wordprocessingDrawing" xmlns:w10="urn:schemas-microsoft-com:office:word" xmlns:w="http://schemas.openxmlformats.org/wordprocessingml/2006/main" xmlns:w14="http://schemas.microsoft.com/office/word/2010/wordml" xmlns:w15="http://schemas.microsoft.com/office/word/2012/wordml" xmlns:w16cex="http://schemas.microsoft.com/office/word/2018/wordml/cex" xmlns:w16cid="http://schemas.microsoft.com/office/word/2016/wordml/cid" xmlns:w16="http://schemas.microsoft.com/office/word/2018/wordml" xmlns:w16du="http://schemas.microsoft.com/office/word/2023/wordml/word16du" xmlns:w16sdtdh="http://schemas.microsoft.com/office/word/2020/wordml/sdtdatahash" xmlns:w16sdtfl="http://schemas.microsoft.com/office/word/2024/wordml/sdtformatlock" xmlns:w16se="http://schemas.microsoft.com/office/word/2015/wordml/symex" xmlns:wpg="http://schemas.microsoft.com/office/word/2010/wordprocessingGroup" xmlns:wpi="http://schemas.microsoft.com/office/word/2010/wordprocessingInk" xmlns:wne="http://schemas.microsoft.com/office/word/2006/wordml" xmlns:wps="http://schemas.microsoft.com/office/word/2010/wordprocessingShape" mc:Ignorable="w14 w15 w16se w16cid w16 w16cex w16sdtdh w16sdtfl w16du wp14">
-  <w:p>
-    <w:pPr>
-      <w:pStyle w:val="ae"/>
-    </w:pPr>
-  </w:p>
-</w:hdr>
-</file>
-
-<file path=word/header2.xml><?xml version="1.0" encoding="utf-8"?>
-<w:hdr xmlns:wpc="http://schemas.microsoft.com/office/word/2010/wordprocessingCanvas" xmlns:cx="http://schemas.microsoft.com/office/drawing/2014/chartex" xmlns:cx1="http://schemas.microsoft.com/office/drawing/2015/9/8/chartex" xmlns:cx2="http://schemas.microsoft.com/office/drawing/2015/10/21/chartex" xmlns:cx3="http://schemas.microsoft.com/office/drawing/2016/5/9/chartex" xmlns:cx4="http://schemas.microsoft.com/office/drawing/2016/5/10/chartex" xmlns:cx5="http://schemas.microsoft.com/office/drawing/2016/5/11/chartex" xmlns:cx6="http://schemas.microsoft.com/office/drawing/2016/5/12/chartex" xmlns:cx7="http://schemas.microsoft.com/office/drawing/2016/5/13/chartex" xmlns:cx8="http://schemas.microsoft.com/office/drawing/2016/5/14/chartex" xmlns:mc="http://schemas.openxmlformats.org/markup-compatibility/2006" xmlns:aink="http://schemas.microsoft.com/office/drawing/2016/ink" xmlns:am3d="http://schemas.microsoft.com/office/drawing/2017/model3d" xmlns:o="urn:schemas-microsoft-com:office:office" xmlns:oel="http://schemas.microsoft.com/office/2019/extlst" xmlns:r="http://schemas.openxmlformats.org/officeDocument/2006/relationships" xmlns:m="http://schemas.openxmlformats.org/officeDocument/2006/math" xmlns:v="urn:schemas-microsoft-com:vml" xmlns:wp14="http://schemas.microsoft.com/office/word/2010/wordprocessingDrawing" xmlns:wp="http://schemas.openxmlformats.org/drawingml/2006/wordprocessingDrawing" xmlns:w10="urn:schemas-microsoft-com:office:word" xmlns:w="http://schemas.openxmlformats.org/wordprocessingml/2006/main" xmlns:w14="http://schemas.microsoft.com/office/word/2010/wordml" xmlns:w15="http://schemas.microsoft.com/office/word/2012/wordml" xmlns:w16cex="http://schemas.microsoft.com/office/word/2018/wordml/cex" xmlns:w16cid="http://schemas.microsoft.com/office/word/2016/wordml/cid" xmlns:w16="http://schemas.microsoft.com/office/word/2018/wordml" xmlns:w16du="http://schemas.microsoft.com/office/word/2023/wordml/word16du" xmlns:w16sdtdh="http://schemas.microsoft.com/office/word/2020/wordml/sdtdatahash" xmlns:w16sdtfl="http://schemas.microsoft.com/office/word/2024/wordml/sdtformatlock" xmlns:w16se="http://schemas.microsoft.com/office/word/2015/wordml/symex" xmlns:wpg="http://schemas.microsoft.com/office/word/2010/wordprocessingGroup" xmlns:wpi="http://schemas.microsoft.com/office/word/2010/wordprocessingInk" xmlns:wne="http://schemas.microsoft.com/office/word/2006/wordml" xmlns:wps="http://schemas.microsoft.com/office/word/2010/wordprocessingShape" mc:Ignorable="w14 w15 w16se w16cid w16 w16cex w16sdtdh w16sdtfl w16du wp14">
-  <w:p>
-    <w:pPr>
-      <w:pStyle w:val="ae"/>
-    </w:pPr>
-  </w:p>
-</w:hdr>
-</file>
-
-<file path=word/header3.xml><?xml version="1.0" encoding="utf-8"?>
-<w:hdr xmlns:wpc="http://schemas.microsoft.com/office/word/2010/wordprocessingCanvas" xmlns:cx="http://schemas.microsoft.com/office/drawing/2014/chartex" xmlns:cx1="http://schemas.microsoft.com/office/drawing/2015/9/8/chartex" xmlns:cx2="http://schemas.microsoft.com/office/drawing/2015/10/21/chartex" xmlns:cx3="http://schemas.microsoft.com/office/drawing/2016/5/9/chartex" xmlns:cx4="http://schemas.microsoft.com/office/drawing/2016/5/10/chartex" xmlns:cx5="http://schemas.microsoft.com/office/drawing/2016/5/11/chartex" xmlns:cx6="http://schemas.microsoft.com/office/drawing/2016/5/12/chartex" xmlns:cx7="http://schemas.microsoft.com/office/drawing/2016/5/13/chartex" xmlns:cx8="http://schemas.microsoft.com/office/drawing/2016/5/14/chartex" xmlns:mc="http://schemas.openxmlformats.org/markup-compatibility/2006" xmlns:aink="http://schemas.microsoft.com/office/drawing/2016/ink" xmlns:am3d="http://schemas.microsoft.com/office/drawing/2017/model3d" xmlns:o="urn:schemas-microsoft-com:office:office" xmlns:oel="http://schemas.microsoft.com/office/2019/extlst" xmlns:r="http://schemas.openxmlformats.org/officeDocument/2006/relationships" xmlns:m="http://schemas.openxmlformats.org/officeDocument/2006/math" xmlns:v="urn:schemas-microsoft-com:vml" xmlns:wp14="http://schemas.microsoft.com/office/word/2010/wordprocessingDrawing" xmlns:wp="http://schemas.openxmlformats.org/drawingml/2006/wordprocessingDrawing" xmlns:w10="urn:schemas-microsoft-com:office:word" xmlns:w="http://schemas.openxmlformats.org/wordprocessingml/2006/main" xmlns:w14="http://schemas.microsoft.com/office/word/2010/wordml" xmlns:w15="http://schemas.microsoft.com/office/word/2012/wordml" xmlns:w16cex="http://schemas.microsoft.com/office/word/2018/wordml/cex" xmlns:w16cid="http://schemas.microsoft.com/office/word/2016/wordml/cid" xmlns:w16="http://schemas.microsoft.com/office/word/2018/wordml" xmlns:w16du="http://schemas.microsoft.com/office/word/2023/wordml/word16du" xmlns:w16sdtdh="http://schemas.microsoft.com/office/word/2020/wordml/sdtdatahash" xmlns:w16sdtfl="http://schemas.microsoft.com/office/word/2024/wordml/sdtformatlock" xmlns:w16se="http://schemas.microsoft.com/office/word/2015/wordml/symex" xmlns:wpg="http://schemas.microsoft.com/office/word/2010/wordprocessingGroup" xmlns:wpi="http://schemas.microsoft.com/office/word/2010/wordprocessingInk" xmlns:wne="http://schemas.microsoft.com/office/word/2006/wordml" xmlns:wps="http://schemas.microsoft.com/office/word/2010/wordprocessingShape" mc:Ignorable="w14 w15 w16se w16cid w16 w16cex w16sdtdh w16sdtfl w16du wp14">
-  <w:p>
-    <w:pPr>
-      <w:pStyle w:val="ae"/>
-    </w:pPr>
-  </w:p>
-</w:hdr>
 </file>
 
 <file path=word/numbering.xml><?xml version="1.0" encoding="utf-8"?>
@@ -23465,6 +23408,28 @@
       <w:ind w:left="440"/>
     </w:pPr>
   </w:style>
+  <w:style w:type="paragraph" w:styleId="af2">
+    <w:name w:val="footer"/>
+    <w:basedOn w:val="a"/>
+    <w:link w:val="af3"/>
+    <w:uiPriority w:val="99"/>
+    <w:unhideWhenUsed/>
+    <w:rsid w:val="00700FF9"/>
+    <w:pPr>
+      <w:tabs>
+        <w:tab w:val="center" w:pos="4153"/>
+        <w:tab w:val="right" w:pos="8306"/>
+      </w:tabs>
+      <w:spacing w:after="0" w:line="240" w:lineRule="auto"/>
+    </w:pPr>
+  </w:style>
+  <w:style w:type="character" w:customStyle="1" w:styleId="af3">
+    <w:name w:val="כותרת תחתונה תו"/>
+    <w:basedOn w:val="a0"/>
+    <w:link w:val="af2"/>
+    <w:uiPriority w:val="99"/>
+    <w:rsid w:val="00700FF9"/>
+  </w:style>
 </w:styles>
 </file>
 

</xml_diff>